<commit_message>
Align resume skills with portfolio, drop Continuous Learning section
- Remove Continuous Learning section (authority positioning, not learner)
- Trim AI & LLM skills row to match the portfolio's LLM engineering
  category (drop Streaming, Structured Outputs, Prompt Caching)
- Restore Aifyy end date to May 2026; widen spacing to keep page filled
- Regenerate resume.pdf and resume.docx

Co-Authored-By: Claude Fable 5 <noreply@anthropic.com>
</commit_message>
<xml_diff>
--- a/public/resume.docx
+++ b/public/resume.docx
@@ -872,7 +872,7 @@
           <w:spacing w:val="0"/>
           <w:color w:val="141414"/>
         </w:rPr>
-        <w:t xml:space="preserve"> Anthropic Claude API, AI Agents, Tool Use, RAG Systems, LLM Orchestration, Streaming, Structured Outputs, Prompt Caching</w:t>
+        <w:t xml:space="preserve"> Anthropic Claude API, AI Agents, Tool Use, RAG Systems, LLM Orchestration</w:t>
       </w:r>
     </w:p>
     <w:p>
@@ -1003,109 +1003,6 @@
           <w:color w:val="141414"/>
         </w:rPr>
         <w:t xml:space="preserve"> Claude Code, Git, GitHub</w:t>
-      </w:r>
-    </w:p>
-    <w:p>
-      <w:pPr>
-        <w:spacing w:after="106"/>
-      </w:pPr>
-      <w:r>
-        <w:rPr>
-          <w:rFonts w:ascii="Arial" w:hAnsi="Arial" w:cs="Arial"/>
-          <w:sz w:val="32"/>
-          <w:sz-cs w:val="32"/>
-          <w:b/>
-          <w:spacing w:val="0"/>
-          <w:color w:val="152745"/>
-        </w:rPr>
-        <w:t xml:space="preserve">CONTINUOUS LEARNING</w:t>
-      </w:r>
-    </w:p>
-    <w:p>
-      <w:pPr>
-        <w:ind w:left="720" w:first-line="-720"/>
-        <w:spacing w:after="80"/>
-      </w:pPr>
-      <w:r>
-        <w:rPr>
-          <w:rFonts w:ascii="Arial" w:hAnsi="Arial" w:cs="Arial"/>
-          <w:sz w:val="29"/>
-          <w:sz-cs w:val="29"/>
-          <w:color w:val="141414"/>
-        </w:rPr>
-        <w:t xml:space="preserve"/>
-        <w:tab/>
-        <w:t xml:space="preserve">•</w:t>
-        <w:tab/>
-        <w:t xml:space="preserve"/>
-      </w:r>
-      <w:r>
-        <w:rPr>
-          <w:rFonts w:ascii="Arial" w:hAnsi="Arial" w:cs="Arial"/>
-          <w:sz w:val="29"/>
-          <w:sz-cs w:val="29"/>
-          <w:spacing w:val="0"/>
-          <w:color w:val="141414"/>
-        </w:rPr>
-        <w:t xml:space="preserve">Completing 28-week AI Engineering program: Python, LLM Applications, Agent Systems, RAG Pipelines, LangGraph, FastAPI, and Production Deployment</w:t>
-      </w:r>
-    </w:p>
-    <w:p>
-      <w:pPr>
-        <w:ind w:left="720" w:first-line="-720"/>
-        <w:spacing w:after="80"/>
-      </w:pPr>
-      <w:r>
-        <w:rPr>
-          <w:rFonts w:ascii="Arial" w:hAnsi="Arial" w:cs="Arial"/>
-          <w:sz w:val="29"/>
-          <w:sz-cs w:val="29"/>
-          <w:color w:val="141414"/>
-        </w:rPr>
-        <w:t xml:space="preserve"/>
-        <w:tab/>
-        <w:t xml:space="preserve">•</w:t>
-        <w:tab/>
-        <w:t xml:space="preserve"/>
-      </w:r>
-      <w:r>
-        <w:rPr>
-          <w:rFonts w:ascii="Arial" w:hAnsi="Arial" w:cs="Arial"/>
-          <w:sz w:val="29"/>
-          <w:sz-cs w:val="29"/>
-          <w:spacing w:val="0"/>
-          <w:color w:val="141414"/>
-        </w:rPr>
-        <w:t xml:space="preserve">Active DSA practice on NeetCode: arrays, hashmaps, two pointers</w:t>
-      </w:r>
-    </w:p>
-    <w:p>
-      <w:pPr>
-        <w:ind w:left="720" w:first-line="-720"/>
-        <w:spacing w:after="80"/>
-      </w:pPr>
-      <w:r>
-        <w:rPr>
-          <w:rFonts w:ascii="Arial" w:hAnsi="Arial" w:cs="Arial"/>
-          <w:sz w:val="29"/>
-          <w:sz-cs w:val="29"/>
-          <w:color w:val="141414"/>
-        </w:rPr>
-        <w:t xml:space="preserve"/>
-        <w:tab/>
-        <w:t xml:space="preserve">•</w:t>
-        <w:tab/>
-        <w:t xml:space="preserve"/>
-      </w:r>
-      <w:r>
-        <w:rPr>
-          <w:rFonts w:ascii="Arial" w:hAnsi="Arial" w:cs="Arial"/>
-          <w:sz w:val="29"/>
-          <w:sz-cs w:val="29"/>
-          <w:spacing w:val="0"/>
-          <w:color w:val="141414"/>
-        </w:rPr>
-        <w:t xml:space="preserve">YouTube channel: teaching Claude Code and AI automation in Hinglish, 18+ videos published</w:t>
       </w:r>
     </w:p>
     <w:p>

</xml_diff>

<commit_message>
Correct teaching dates: Career Point from 2019, 6+ years total
Co-Authored-By: Claude Fable 5 <noreply@anthropic.com>
</commit_message>
<xml_diff>
--- a/public/resume.docx
+++ b/public/resume.docx
@@ -696,7 +696,7 @@
           <w:spacing w:val="0"/>
           <w:color w:val="141414"/>
         </w:rPr>
-        <w:t xml:space="preserve">Mathematics Faculty, Vidyalankar, Mumbai (2021-2025) | Career Point, Kota (2018-2021)</w:t>
+        <w:t xml:space="preserve">Mathematics Faculty, Vidyalankar, Mumbai (2021-2025) | Career Point, Kota (2019-2021)</w:t>
       </w:r>
     </w:p>
     <w:p>
@@ -727,7 +727,7 @@
           <w:spacing w:val="0"/>
           <w:color w:val="141414"/>
         </w:rPr>
-        <w:t xml:space="preserve">8 years teaching IIT-JEE Mathematics</w:t>
+        <w:t xml:space="preserve">6+ years teaching IIT-JEE Mathematics</w:t>
       </w:r>
       <w:r>
         <w:rPr>

</xml_diff>

<commit_message>
Add OpenRouter to resume skills, fix DOCX paragraph breaks
OpenRouter is used in the n8n workflows and already listed on the
portfolio. DOCX now puts each skills row and job subheading in its own
paragraph so ATS parsers don't merge them into one line.

Co-Authored-By: Claude Opus 5.5 <noreply@anthropic.com>
</commit_message>
<xml_diff>
--- a/public/resume.docx
+++ b/public/resume.docx
@@ -198,7 +198,20 @@
           <w:color w:val="101010"/>
         </w:rPr>
         <w:t xml:space="preserve">, Institura, Mumbai (Dec 2025 - Present)</w:t>
-        <w:br/>
+      </w:r>
+    </w:p>
+    <w:p>
+      <w:pPr>
+        <w:spacing w:after="160"/>
+      </w:pPr>
+      <w:r>
+        <w:rPr>
+          <w:rFonts w:ascii="Arial" w:hAnsi="Arial" w:cs="Arial"/>
+          <w:sz w:val="29"/>
+          <w:sz-cs w:val="29"/>
+          <w:spacing w:val="0"/>
+          <w:color w:val="101010"/>
+        </w:rPr>
         <w:t xml:space="preserve">AI Operating System for Coaching Institutes | institura.com</w:t>
       </w:r>
     </w:p>
@@ -426,7 +439,20 @@
           <w:color w:val="101010"/>
         </w:rPr>
         <w:t xml:space="preserve">, Aifyy (May 2025 - May 2026)</w:t>
-        <w:br/>
+      </w:r>
+    </w:p>
+    <w:p>
+      <w:pPr>
+        <w:spacing w:after="160"/>
+      </w:pPr>
+      <w:r>
+        <w:rPr>
+          <w:rFonts w:ascii="Arial" w:hAnsi="Arial" w:cs="Arial"/>
+          <w:sz w:val="29"/>
+          <w:sz-cs w:val="29"/>
+          <w:spacing w:val="0"/>
+          <w:color w:val="101010"/>
+        </w:rPr>
         <w:t xml:space="preserve">Internal AI automation for sales and client operations</w:t>
       </w:r>
     </w:p>
@@ -762,9 +788,12 @@
           <w:color w:val="101010"/>
         </w:rPr>
         <w:t xml:space="preserve"> Python</w:t>
-        <w:br/>
-        <w:t xml:space="preserve"/>
-      </w:r>
+      </w:r>
+    </w:p>
+    <w:p>
+      <w:pPr>
+        <w:spacing w:after="160"/>
+      </w:pPr>
       <w:r>
         <w:rPr>
           <w:rFonts w:ascii="Arial" w:hAnsi="Arial" w:cs="Arial"/>
@@ -785,9 +814,12 @@
           <w:color w:val="101010"/>
         </w:rPr>
         <w:t xml:space="preserve"> Anthropic Claude API, AI Agents, Tool Use, RAG Systems, LLM Orchestration</w:t>
-        <w:br/>
-        <w:t xml:space="preserve"/>
-      </w:r>
+      </w:r>
+    </w:p>
+    <w:p>
+      <w:pPr>
+        <w:spacing w:after="160"/>
+      </w:pPr>
       <w:r>
         <w:rPr>
           <w:rFonts w:ascii="Arial" w:hAnsi="Arial" w:cs="Arial"/>
@@ -808,9 +840,12 @@
           <w:color w:val="101010"/>
         </w:rPr>
         <w:t xml:space="preserve"> n8n, Make.com, MCP Servers, Webhooks</w:t>
-        <w:br/>
-        <w:t xml:space="preserve"/>
-      </w:r>
+      </w:r>
+    </w:p>
+    <w:p>
+      <w:pPr>
+        <w:spacing w:after="160"/>
+      </w:pPr>
       <w:r>
         <w:rPr>
           <w:rFonts w:ascii="Arial" w:hAnsi="Arial" w:cs="Arial"/>
@@ -830,10 +865,13 @@
           <w:spacing w:val="0"/>
           <w:color w:val="101010"/>
         </w:rPr>
-        <w:t xml:space="preserve"> Claude, OpenAI, Gemini</w:t>
-        <w:br/>
-        <w:t xml:space="preserve"/>
-      </w:r>
+        <w:t xml:space="preserve"> Claude, OpenAI, Gemini, OpenRouter</w:t>
+      </w:r>
+    </w:p>
+    <w:p>
+      <w:pPr>
+        <w:spacing w:after="160"/>
+      </w:pPr>
       <w:r>
         <w:rPr>
           <w:rFonts w:ascii="Arial" w:hAnsi="Arial" w:cs="Arial"/>
@@ -854,9 +892,12 @@
           <w:color w:val="101010"/>
         </w:rPr>
         <w:t xml:space="preserve"> Airtable, Supabase, Notion, Google Sheets</w:t>
-        <w:br/>
-        <w:t xml:space="preserve"/>
-      </w:r>
+      </w:r>
+    </w:p>
+    <w:p>
+      <w:pPr>
+        <w:spacing w:after="160"/>
+      </w:pPr>
       <w:r>
         <w:rPr>
           <w:rFonts w:ascii="Arial" w:hAnsi="Arial" w:cs="Arial"/>
@@ -877,9 +918,12 @@
           <w:color w:val="101010"/>
         </w:rPr>
         <w:t xml:space="preserve"> PandaDoc, Stripe, Razorpay, Slack, Gmail, Google Drive, Fathom, Apify, Calendly, SerpAPI, Mathpix</w:t>
-        <w:br/>
-        <w:t xml:space="preserve"/>
-      </w:r>
+      </w:r>
+    </w:p>
+    <w:p>
+      <w:pPr>
+        <w:spacing w:after="160"/>
+      </w:pPr>
       <w:r>
         <w:rPr>
           <w:rFonts w:ascii="Arial" w:hAnsi="Arial" w:cs="Arial"/>

</xml_diff>

<commit_message>
Add RAG knowledge base project, retrieval skills, retitle Institura role
Site: new "AI RAG Pipeline: Institura Knowledge Base" project (Voyage AI
embeddings, ChromaDB, rerank-2, Claude Haiku grounded answers) linking to
the phase4 code. About tools panel adds Anthropic SDK, RAG Pipelines, MCP
Servers, Claude Haiku / Sonnet, Voyage AI and ChromaDB. Other-projects
cards show tech badges and a GitHub link. heroImage is now optional, with
the site OG image as the fallback preview.

Resume: Founder becomes Built & Operates Institura, RAG bullet added under
Institura, skills mirror the site. PDF and DOCX regenerated, still one page.

Co-Authored-By: Claude Opus 5.5 <noreply@anthropic.com>
</commit_message>
<xml_diff>
--- a/public/resume.docx
+++ b/public/resume.docx
@@ -187,17 +187,17 @@
           <w:spacing w:val="0"/>
           <w:color w:val="101010"/>
         </w:rPr>
-        <w:t xml:space="preserve">Founder</w:t>
-      </w:r>
-      <w:r>
-        <w:rPr>
-          <w:rFonts w:ascii="Arial" w:hAnsi="Arial" w:cs="Arial"/>
-          <w:sz w:val="29"/>
-          <w:sz-cs w:val="29"/>
-          <w:spacing w:val="0"/>
-          <w:color w:val="101010"/>
-        </w:rPr>
-        <w:t xml:space="preserve">, Institura, Mumbai (Dec 2025 - Present)</w:t>
+        <w:t xml:space="preserve">Built &amp; Operates Institura</w:t>
+      </w:r>
+      <w:r>
+        <w:rPr>
+          <w:rFonts w:ascii="Arial" w:hAnsi="Arial" w:cs="Arial"/>
+          <w:sz w:val="29"/>
+          <w:sz-cs w:val="29"/>
+          <w:spacing w:val="0"/>
+          <w:color w:val="101010"/>
+        </w:rPr>
+        <w:t xml:space="preserve">, Mumbai (Dec 2025 - Present)</w:t>
       </w:r>
     </w:p>
     <w:p>
@@ -413,6 +413,46 @@
           <w:color w:val="101010"/>
         </w:rPr>
         <w:t xml:space="preserve"> in operational staff cost (admin, typist and data entry roles automated)</w:t>
+      </w:r>
+    </w:p>
+    <w:p>
+      <w:pPr>
+        <w:ind w:left="720" w:first-line="-720"/>
+      </w:pPr>
+      <w:r>
+        <w:rPr>
+          <w:rFonts w:ascii="Arial" w:hAnsi="Arial" w:cs="Arial"/>
+          <w:sz w:val="29"/>
+          <w:sz-cs w:val="29"/>
+          <w:b/>
+          <w:color w:val="101010"/>
+        </w:rPr>
+        <w:t xml:space="preserve"/>
+        <w:tab/>
+        <w:t xml:space="preserve">•</w:t>
+        <w:tab/>
+        <w:t xml:space="preserve"/>
+      </w:r>
+      <w:r>
+        <w:rPr>
+          <w:rFonts w:ascii="Arial" w:hAnsi="Arial" w:cs="Arial"/>
+          <w:sz w:val="29"/>
+          <w:sz-cs w:val="29"/>
+          <w:b/>
+          <w:spacing w:val="0"/>
+          <w:color w:val="101010"/>
+        </w:rPr>
+        <w:t xml:space="preserve">AI RAG Pipeline (Institura Knowledge Base):</w:t>
+      </w:r>
+      <w:r>
+        <w:rPr>
+          <w:rFonts w:ascii="Arial" w:hAnsi="Arial" w:cs="Arial"/>
+          <w:sz w:val="29"/>
+          <w:sz-cs w:val="29"/>
+          <w:spacing w:val="0"/>
+          <w:color w:val="101010"/>
+        </w:rPr>
+        <w:t xml:space="preserve"> Prototyped Q&amp;A over student records, batch performance and fee status. Voyage AI embeddings in ChromaDB, cross-encoder reranking, Claude Haiku answers grounded only in retrieved context. Code: github.com/ashishpratapsai/python-for-ai/tree/main/phase4</w:t>
       </w:r>
     </w:p>
     <w:p>
@@ -813,7 +853,7 @@
           <w:spacing w:val="0"/>
           <w:color w:val="101010"/>
         </w:rPr>
-        <w:t xml:space="preserve"> Anthropic Claude API, AI Agents, Tool Use, RAG Systems, LLM Orchestration</w:t>
+        <w:t xml:space="preserve"> Anthropic Claude API, Anthropic SDK, AI Agents, Tool Use, RAG Pipelines (retrieval, reranking, generation), LLM Orchestration</w:t>
       </w:r>
     </w:p>
     <w:p>
@@ -865,7 +905,7 @@
           <w:spacing w:val="0"/>
           <w:color w:val="101010"/>
         </w:rPr>
-        <w:t xml:space="preserve"> Claude, OpenAI, Gemini, OpenRouter</w:t>
+        <w:t xml:space="preserve"> Claude, OpenAI, Gemini, OpenRouter, Voyage AI (embeddings, reranking)</w:t>
       </w:r>
     </w:p>
     <w:p>
@@ -891,7 +931,7 @@
           <w:spacing w:val="0"/>
           <w:color w:val="101010"/>
         </w:rPr>
-        <w:t xml:space="preserve"> Airtable, Supabase, Notion, Google Sheets</w:t>
+        <w:t xml:space="preserve"> Airtable, Supabase, ChromaDB, Notion, Google Sheets</w:t>
       </w:r>
     </w:p>
     <w:p>

</xml_diff>

<commit_message>
Update Institura to 3 institutes / 1,200+ students, pull RAG prototype
Institura adoption numbers updated across site metadata, project data and
resume (HTML, PDF, DOCX). The standalone RAG card and resume bullet are
removed until RAG ships as a real Institura feature; the retrieval skills
stay. About copy now claims LLM systems in Python and TypeScript (tool use,
batch processing, prompt caching) instead of autonomous agents, and the
tools badge is back to plain Claude.

Co-Authored-By: Claude Opus 5.5 <noreply@anthropic.com>
</commit_message>
<xml_diff>
--- a/public/resume.docx
+++ b/public/resume.docx
@@ -155,7 +155,7 @@
           <w:spacing w:val="0"/>
           <w:color w:val="101010"/>
         </w:rPr>
-        <w:t xml:space="preserve">AI automation engineer who builds LLM-powered systems that replace manual operations for businesses, from the first conversation with the operator to the shipped workflow. Built Institura solo: a production SaaS with 30+ modules running 2 coaching institutes with 600+ students, replacing roughly ₹10L+/yr in staff cost per institute. Personally onboard and train every customer, then ship improvements from their feedback. At Aifyy, shipped Claude and n8n systems that cut proposal turnaround from 2-3 days to 52 seconds. Build with Python, the Anthropic Claude API, n8n and MCP servers. Before engineering, spent 6+ years as IIT-JEE Mathematics faculty: years of explaining complex ideas to non-technical people, and first-hand knowledge of the institutes Institura now runs on.</w:t>
+        <w:t xml:space="preserve">AI automation engineer who builds LLM-powered systems that replace manual operations for businesses, from the first conversation with the operator to the shipped workflow. Built Institura solo: a production SaaS with 30+ modules running 3 coaching institutes with 1,200+ students, replacing roughly ₹10L+/yr in staff cost per institute. Personally onboard and train every customer, then ship improvements from their feedback. At Aifyy, shipped Claude and n8n systems that cut proposal turnaround from 2-3 days to 52 seconds. Build with Python, the Anthropic Claude API, n8n and MCP servers. Before engineering, spent 6+ years as IIT-JEE Mathematics faculty: years of explaining complex ideas to non-technical people, and first-hand knowledge of the institutes Institura now runs on.</w:t>
       </w:r>
     </w:p>
     <w:p>
@@ -242,7 +242,7 @@
           <w:spacing w:val="0"/>
           <w:color w:val="101010"/>
         </w:rPr>
-        <w:t xml:space="preserve">Built solo, live at 2 institutes, 600+ students:</w:t>
+        <w:t xml:space="preserve">Built solo, live at 3 institutes, 1,200+ students:</w:t>
       </w:r>
       <w:r>
         <w:rPr>
@@ -413,46 +413,6 @@
           <w:color w:val="101010"/>
         </w:rPr>
         <w:t xml:space="preserve"> in operational staff cost (admin, typist and data entry roles automated)</w:t>
-      </w:r>
-    </w:p>
-    <w:p>
-      <w:pPr>
-        <w:ind w:left="720" w:first-line="-720"/>
-      </w:pPr>
-      <w:r>
-        <w:rPr>
-          <w:rFonts w:ascii="Arial" w:hAnsi="Arial" w:cs="Arial"/>
-          <w:sz w:val="29"/>
-          <w:sz-cs w:val="29"/>
-          <w:b/>
-          <w:color w:val="101010"/>
-        </w:rPr>
-        <w:t xml:space="preserve"/>
-        <w:tab/>
-        <w:t xml:space="preserve">•</w:t>
-        <w:tab/>
-        <w:t xml:space="preserve"/>
-      </w:r>
-      <w:r>
-        <w:rPr>
-          <w:rFonts w:ascii="Arial" w:hAnsi="Arial" w:cs="Arial"/>
-          <w:sz w:val="29"/>
-          <w:sz-cs w:val="29"/>
-          <w:b/>
-          <w:spacing w:val="0"/>
-          <w:color w:val="101010"/>
-        </w:rPr>
-        <w:t xml:space="preserve">AI RAG Pipeline (Institura Knowledge Base):</w:t>
-      </w:r>
-      <w:r>
-        <w:rPr>
-          <w:rFonts w:ascii="Arial" w:hAnsi="Arial" w:cs="Arial"/>
-          <w:sz w:val="29"/>
-          <w:sz-cs w:val="29"/>
-          <w:spacing w:val="0"/>
-          <w:color w:val="101010"/>
-        </w:rPr>
-        <w:t xml:space="preserve"> Prototyped Q&amp;A over student records, batch performance and fee status. Voyage AI embeddings in ChromaDB, cross-encoder reranking, Claude Haiku answers grounded only in retrieved context. Code: github.com/ashishpratapsai/python-for-ai/tree/main/phase4</w:t>
       </w:r>
     </w:p>
     <w:p>

</xml_diff>